<commit_message>
Add WinGet Java-blocking update script
This commit adds a PowerShell script to update all WinGet applications while explicitly pinning Java-related packages to block upgrades. It also updates the internal HTTPS enablement SOP document for the current process.
</commit_message>
<xml_diff>
--- a/Tasks/WebFOCUS_Internal_HTTPS_Enablement_SOP.docx
+++ b/Tasks/WebFOCUS_Internal_HTTPS_Enablement_SOP.docx
@@ -308,11 +308,6 @@
       </w:r>
     </w:p>
     <w:p>
-      <w:pPr>
-        <w:rPr>
-          <w:rFonts w:hint="eastAsia"/>
-        </w:rPr>
-      </w:pPr>
       <w:r>
         <w:t>hostname</w:t>
       </w:r>
@@ -324,7 +319,6 @@
         <w:t>$</w:t>
       </w:r>
       <w:proofErr w:type="spellStart"/>
-      <w:proofErr w:type="gramStart"/>
       <w:r>
         <w:rPr>
           <w:rFonts w:ascii="Consolas" w:hAnsi="Consolas"/>
@@ -332,7 +326,6 @@
         <w:t>env:COMPUTERNAME</w:t>
       </w:r>
       <w:proofErr w:type="spellEnd"/>
-      <w:proofErr w:type="gramEnd"/>
       <w:r>
         <w:rPr>
           <w:rFonts w:ascii="Consolas" w:hAnsi="Consolas"/>
@@ -365,84 +358,14 @@
           <w:rFonts w:ascii="Consolas" w:hAnsi="Consolas"/>
         </w:rPr>
         <w:br/>
-        <w:t xml:space="preserve">Where-Object </w:t>
-      </w:r>
-      <w:proofErr w:type="gramStart"/>
-      <w:r>
-        <w:rPr>
-          <w:rFonts w:ascii="Consolas" w:hAnsi="Consolas"/>
-        </w:rPr>
-        <w:t>{ $_.Name</w:t>
-      </w:r>
-      <w:proofErr w:type="gramEnd"/>
-      <w:r>
-        <w:rPr>
-          <w:rFonts w:ascii="Consolas" w:hAnsi="Consolas"/>
-        </w:rPr>
-        <w:t xml:space="preserve"> -match "Tomcat" -or $</w:t>
-      </w:r>
-      <w:proofErr w:type="gramStart"/>
-      <w:r>
-        <w:rPr>
-          <w:rFonts w:ascii="Consolas" w:hAnsi="Consolas"/>
-        </w:rPr>
-        <w:t>_.DisplayName</w:t>
-      </w:r>
-      <w:proofErr w:type="gramEnd"/>
-      <w:r>
-        <w:rPr>
-          <w:rFonts w:ascii="Consolas" w:hAnsi="Consolas"/>
-        </w:rPr>
-        <w:t xml:space="preserve"> -match "Tomcat|WebFOCUS</w:t>
-      </w:r>
-      <w:proofErr w:type="gramStart"/>
-      <w:r>
-        <w:rPr>
-          <w:rFonts w:ascii="Consolas" w:hAnsi="Consolas"/>
-        </w:rPr>
-        <w:t>" }</w:t>
-      </w:r>
-      <w:proofErr w:type="gramEnd"/>
-      <w:r>
-        <w:rPr>
-          <w:rFonts w:ascii="Consolas" w:hAnsi="Consolas"/>
-        </w:rPr>
-        <w:t xml:space="preserve"> |</w:t>
+        <w:t>Where-Object { $_.Name -match "Tomcat" -or $_.DisplayName -match "Tomcat|WebFOCUS" } |</w:t>
       </w:r>
       <w:r>
         <w:rPr>
           <w:rFonts w:ascii="Consolas" w:hAnsi="Consolas"/>
         </w:rPr>
         <w:br/>
-        <w:t xml:space="preserve">Select-Object </w:t>
-      </w:r>
-      <w:proofErr w:type="gramStart"/>
-      <w:r>
-        <w:rPr>
-          <w:rFonts w:ascii="Consolas" w:hAnsi="Consolas"/>
-        </w:rPr>
-        <w:t>Name,DisplayName</w:t>
-      </w:r>
-      <w:proofErr w:type="gramEnd"/>
-      <w:r>
-        <w:rPr>
-          <w:rFonts w:ascii="Consolas" w:hAnsi="Consolas"/>
-        </w:rPr>
-        <w:t>,</w:t>
-      </w:r>
-      <w:proofErr w:type="gramStart"/>
-      <w:r>
-        <w:rPr>
-          <w:rFonts w:ascii="Consolas" w:hAnsi="Consolas"/>
-        </w:rPr>
-        <w:t>State,StartName</w:t>
-      </w:r>
-      <w:proofErr w:type="gramEnd"/>
-      <w:r>
-        <w:rPr>
-          <w:rFonts w:ascii="Consolas" w:hAnsi="Consolas"/>
-        </w:rPr>
-        <w:t>,PathName</w:t>
+        <w:t>Select-Object Name,DisplayName,State,StartName,PathName</w:t>
       </w:r>
     </w:p>
     <w:p>
@@ -488,11 +411,6 @@
       </w:r>
     </w:p>
     <w:p>
-      <w:pPr>
-        <w:rPr>
-          <w:rFonts w:hint="eastAsia"/>
-        </w:rPr>
-      </w:pPr>
       <w:r>
         <w:rPr>
           <w:rFonts w:ascii="Consolas" w:hAnsi="Consolas"/>
@@ -503,112 +421,72 @@
     <w:p>
       <w:r>
         <w:t>Get the short name and FQDN:</w:t>
+      </w:r>
+    </w:p>
+    <w:p>
+      <w:r>
+        <w:rPr>
+          <w:rFonts w:ascii="Consolas" w:hAnsi="Consolas"/>
+        </w:rPr>
+        <w:lastRenderedPageBreak/>
+        <w:t>$ShortName = $env:COMPUTERNAME</w:t>
+      </w:r>
+      <w:r>
+        <w:rPr>
+          <w:rFonts w:ascii="Consolas" w:hAnsi="Consolas"/>
+        </w:rPr>
+        <w:br/>
+        <w:t>$Fqdn = [System.Net.Dns]::GetHostEntry($ShortName).HostName</w:t>
+      </w:r>
+      <w:r>
+        <w:rPr>
+          <w:rFonts w:ascii="Consolas" w:hAnsi="Consolas"/>
+        </w:rPr>
+        <w:br/>
+      </w:r>
+      <w:r>
+        <w:rPr>
+          <w:rFonts w:ascii="Consolas" w:hAnsi="Consolas"/>
+        </w:rPr>
+        <w:br/>
+        <w:t>$ShortName</w:t>
+      </w:r>
+      <w:r>
+        <w:rPr>
+          <w:rFonts w:ascii="Consolas" w:hAnsi="Consolas"/>
+        </w:rPr>
+        <w:br/>
+        <w:t>$Fqdn</w:t>
+      </w:r>
+    </w:p>
+    <w:p>
+      <w:r>
+        <w:t>Verify both names resolve to the expected WebFOCUS server:</w:t>
+      </w:r>
+    </w:p>
+    <w:p>
+      <w:r>
+        <w:rPr>
+          <w:rFonts w:ascii="Consolas" w:hAnsi="Consolas"/>
+        </w:rPr>
+        <w:t>Resolve-DnsName $ShortName</w:t>
+      </w:r>
+      <w:r>
+        <w:rPr>
+          <w:rFonts w:ascii="Consolas" w:hAnsi="Consolas"/>
+        </w:rPr>
+        <w:br/>
+        <w:t>Resolve-DnsName $Fqdn</w:t>
+      </w:r>
+    </w:p>
+    <w:p>
+      <w:r>
+        <w:t>The certificate request will include both names:</w:t>
       </w:r>
     </w:p>
     <w:p>
       <w:pPr>
         <w:rPr>
-          <w:rFonts w:hint="eastAsia"/>
-        </w:rPr>
-      </w:pPr>
-      <w:r>
-        <w:rPr>
-          <w:rFonts w:ascii="Consolas" w:hAnsi="Consolas"/>
-        </w:rPr>
-        <w:lastRenderedPageBreak/>
-        <w:t>$ShortName = $</w:t>
-      </w:r>
-      <w:proofErr w:type="gramStart"/>
-      <w:r>
-        <w:rPr>
-          <w:rFonts w:ascii="Consolas" w:hAnsi="Consolas"/>
-        </w:rPr>
-        <w:t>env:COMPUTERNAME</w:t>
-      </w:r>
-      <w:proofErr w:type="gramEnd"/>
-      <w:r>
-        <w:rPr>
-          <w:rFonts w:ascii="Consolas" w:hAnsi="Consolas"/>
-        </w:rPr>
-        <w:br/>
-        <w:t>$Fqdn = [System.Net.Dns</w:t>
-      </w:r>
-      <w:proofErr w:type="gramStart"/>
-      <w:r>
-        <w:rPr>
-          <w:rFonts w:ascii="Consolas" w:hAnsi="Consolas"/>
-        </w:rPr>
-        <w:t>]::</w:t>
-      </w:r>
-      <w:proofErr w:type="gramEnd"/>
-      <w:r>
-        <w:rPr>
-          <w:rFonts w:ascii="Consolas" w:hAnsi="Consolas"/>
-        </w:rPr>
-        <w:t>GetHostEntry($ShortName</w:t>
-      </w:r>
-      <w:proofErr w:type="gramStart"/>
-      <w:r>
-        <w:rPr>
-          <w:rFonts w:ascii="Consolas" w:hAnsi="Consolas"/>
-        </w:rPr>
-        <w:t>).HostName</w:t>
-      </w:r>
-      <w:proofErr w:type="gramEnd"/>
-      <w:r>
-        <w:rPr>
-          <w:rFonts w:ascii="Consolas" w:hAnsi="Consolas"/>
-        </w:rPr>
-        <w:br/>
-      </w:r>
-      <w:r>
-        <w:rPr>
-          <w:rFonts w:ascii="Consolas" w:hAnsi="Consolas"/>
-        </w:rPr>
-        <w:br/>
-        <w:t>$ShortName</w:t>
-      </w:r>
-      <w:r>
-        <w:rPr>
-          <w:rFonts w:ascii="Consolas" w:hAnsi="Consolas"/>
-        </w:rPr>
-        <w:br/>
-        <w:t>$Fqdn</w:t>
-      </w:r>
-    </w:p>
-    <w:p>
-      <w:r>
-        <w:t>Verify both names resolve to the expected WebFOCUS server:</w:t>
-      </w:r>
-    </w:p>
-    <w:p>
-      <w:pPr>
-        <w:rPr>
-          <w:rFonts w:hint="eastAsia"/>
-        </w:rPr>
-      </w:pPr>
-      <w:r>
-        <w:rPr>
-          <w:rFonts w:ascii="Consolas" w:hAnsi="Consolas"/>
-        </w:rPr>
-        <w:t>Resolve-DnsName $ShortName</w:t>
-      </w:r>
-      <w:r>
-        <w:rPr>
-          <w:rFonts w:ascii="Consolas" w:hAnsi="Consolas"/>
-        </w:rPr>
-        <w:br/>
-        <w:t>Resolve-DnsName $Fqdn</w:t>
-      </w:r>
-    </w:p>
-    <w:p>
-      <w:r>
-        <w:t>The certificate request will include both names:</w:t>
-      </w:r>
-    </w:p>
-    <w:p>
-      <w:pPr>
-        <w:rPr>
           <w:rFonts w:ascii="Consolas" w:hAnsi="Consolas"/>
         </w:rPr>
       </w:pPr>
@@ -640,82 +518,6 @@
         <w:t>SERVERNAME.domain.example</w:t>
       </w:r>
       <w:proofErr w:type="spellEnd"/>
-    </w:p>
-    <w:p>
-      <w:pPr>
-        <w:rPr>
-          <w:rFonts w:hint="eastAsia"/>
-        </w:rPr>
-      </w:pPr>
-    </w:p>
-    <w:p>
-      <w:pPr>
-        <w:rPr>
-          <w:b/>
-          <w:bCs/>
-        </w:rPr>
-      </w:pPr>
-      <w:r>
-        <w:rPr>
-          <w:b/>
-          <w:bCs/>
-        </w:rPr>
-        <w:t>4. Confirm TCP 443 is available</w:t>
-      </w:r>
-    </w:p>
-    <w:p>
-      <w:pPr>
-        <w:rPr>
-          <w:rFonts w:hint="eastAsia"/>
-        </w:rPr>
-      </w:pPr>
-      <w:r>
-        <w:rPr>
-          <w:rFonts w:ascii="Consolas" w:hAnsi="Consolas"/>
-        </w:rPr>
-        <w:t>Get-NetTCPConnection -LocalPort 443 -State Listen -ErrorAction SilentlyContinue</w:t>
-      </w:r>
-    </w:p>
-    <w:p>
-      <w:r>
-        <w:t xml:space="preserve">If this returns nothing, port 443 is not currently listening. If it </w:t>
-      </w:r>
-      <w:proofErr w:type="gramStart"/>
-      <w:r>
-        <w:t>returns</w:t>
-      </w:r>
-      <w:proofErr w:type="gramEnd"/>
-      <w:r>
-        <w:t xml:space="preserve"> a process, identify it before continuing:</w:t>
-      </w:r>
-    </w:p>
-    <w:p>
-      <w:pPr>
-        <w:rPr>
-          <w:rFonts w:hint="eastAsia"/>
-        </w:rPr>
-      </w:pPr>
-      <w:r>
-        <w:rPr>
-          <w:rFonts w:ascii="Consolas" w:hAnsi="Consolas"/>
-        </w:rPr>
-        <w:t>$c = Get-NetTCPConnection -LocalPort 443 -State Listen</w:t>
-      </w:r>
-      <w:r>
-        <w:rPr>
-          <w:rFonts w:ascii="Consolas" w:hAnsi="Consolas"/>
-        </w:rPr>
-        <w:br/>
-        <w:t>Get-Process -Id $</w:t>
-      </w:r>
-      <w:proofErr w:type="gramStart"/>
-      <w:r>
-        <w:rPr>
-          <w:rFonts w:ascii="Consolas" w:hAnsi="Consolas"/>
-        </w:rPr>
-        <w:t>c.OwningProcess</w:t>
-      </w:r>
-      <w:proofErr w:type="gramEnd"/>
     </w:p>
     <w:p/>
     <w:p>
@@ -730,50 +532,35 @@
           <w:b/>
           <w:bCs/>
         </w:rPr>
-        <w:t>5. Locate and back up Tomcat server.xml</w:t>
+        <w:t>4. Confirm TCP 443 is available</w:t>
       </w:r>
     </w:p>
     <w:p>
       <w:r>
-        <w:t>For a typical ibi-supplied Tomcat installation, the file may be:</w:t>
+        <w:rPr>
+          <w:rFonts w:ascii="Consolas" w:hAnsi="Consolas"/>
+        </w:rPr>
+        <w:t>Get-NetTCPConnection -LocalPort 443 -State Listen -ErrorAction SilentlyContinue</w:t>
       </w:r>
     </w:p>
     <w:p>
-      <w:pPr>
-        <w:rPr>
-          <w:rFonts w:hint="eastAsia"/>
-        </w:rPr>
-      </w:pPr>
-      <w:r>
-        <w:rPr>
-          <w:rFonts w:ascii="Consolas" w:hAnsi="Consolas"/>
-        </w:rPr>
-        <w:t>C:\ibi\tomcat\conf\server.xml</w:t>
+      <w:r>
+        <w:t>If this returns nothing, port 443 is not currently listening. If it returns a process, identify it before continuing:</w:t>
       </w:r>
     </w:p>
     <w:p>
-      <w:pPr>
-        <w:rPr>
-          <w:rFonts w:hint="eastAsia"/>
-        </w:rPr>
-      </w:pPr>
-      <w:r>
-        <w:rPr>
-          <w:rFonts w:ascii="Consolas" w:hAnsi="Consolas"/>
-        </w:rPr>
-        <w:t>Copy-Item "C:\ibi\tomcat\conf\server.xml" `</w:t>
+      <w:r>
+        <w:rPr>
+          <w:rFonts w:ascii="Consolas" w:hAnsi="Consolas"/>
+        </w:rPr>
+        <w:t>$c = Get-NetTCPConnection -LocalPort 443 -State Listen</w:t>
       </w:r>
       <w:r>
         <w:rPr>
           <w:rFonts w:ascii="Consolas" w:hAnsi="Consolas"/>
         </w:rPr>
         <w:br/>
-        <w:t xml:space="preserve">          "C:\ibi\tomcat\conf\server.xml.pre-https.bak"</w:t>
-      </w:r>
-    </w:p>
-    <w:p>
-      <w:r>
-        <w:t>Open server.xml and identify the existing HTTP Connector. Leave it unchanged for now.</w:t>
+        <w:t>Get-Process -Id $c.OwningProcess</w:t>
       </w:r>
     </w:p>
     <w:p/>
@@ -789,30 +576,79 @@
           <w:b/>
           <w:bCs/>
         </w:rPr>
-        <w:t>6. Generate the certificate request on the WebFOCUS server</w:t>
+        <w:t>5. Locate and back up Tomcat server.xml</w:t>
       </w:r>
     </w:p>
     <w:p>
       <w:r>
-        <w:t xml:space="preserve">Run PowerShell as Administrator. The following creates an exportable machine private key and a PKCS#10 request containing both the short </w:t>
-      </w:r>
-      <w:proofErr w:type="gramStart"/>
-      <w:r>
-        <w:t>server</w:t>
-      </w:r>
-      <w:proofErr w:type="gramEnd"/>
-      <w:r>
-        <w:t xml:space="preserve"> name and FQDN.</w:t>
+        <w:t>For a typical ibi-supplied Tomcat installation, the file may be:</w:t>
       </w:r>
     </w:p>
     <w:p>
+      <w:r>
+        <w:rPr>
+          <w:rFonts w:ascii="Consolas" w:hAnsi="Consolas"/>
+        </w:rPr>
+        <w:t>C:\ibi\tomcat\conf\server.xml</w:t>
+      </w:r>
+    </w:p>
+    <w:p>
+      <w:r>
+        <w:rPr>
+          <w:rFonts w:ascii="Consolas" w:hAnsi="Consolas"/>
+        </w:rPr>
+        <w:t>Copy-Item "C:\ibi\tomcat\conf\server.xml" `</w:t>
+      </w:r>
+      <w:r>
+        <w:rPr>
+          <w:rFonts w:ascii="Consolas" w:hAnsi="Consolas"/>
+        </w:rPr>
+        <w:br/>
+        <w:t xml:space="preserve">          "C:\ibi\tomcat\conf\server.xml.pre-https.bak"</w:t>
+      </w:r>
+    </w:p>
+    <w:p>
+      <w:r>
+        <w:t>Open server.xml and identify the existing HTTP Connector. Leave it unchanged for now.</w:t>
+      </w:r>
+    </w:p>
+    <w:p/>
+    <w:p>
       <w:pPr>
         <w:rPr>
-          <w:rFonts w:hint="eastAsia"/>
+          <w:b/>
+          <w:bCs/>
         </w:rPr>
       </w:pPr>
       <w:r>
         <w:rPr>
+          <w:b/>
+          <w:bCs/>
+        </w:rPr>
+        <w:t>6. Generate the certificate request on the WebFOCUS server</w:t>
+      </w:r>
+    </w:p>
+    <w:p>
+      <w:r>
+        <w:t>Run PowerShell as Administrator. The following creates an exportable machine private key and a PKCS#10 request containing both the short server name and FQDN.</w:t>
+      </w:r>
+    </w:p>
+    <w:p>
+      <w:r>
+        <w:t>$</w:t>
+      </w:r>
+      <w:proofErr w:type="spellStart"/>
+      <w:r>
+        <w:t>ErrorActionPreference</w:t>
+      </w:r>
+      <w:proofErr w:type="spellEnd"/>
+      <w:r>
+        <w:t xml:space="preserve"> = "Stop"</w:t>
+      </w:r>
+    </w:p>
+    <w:p>
+      <w:r>
+        <w:rPr>
           <w:rFonts w:ascii="Consolas" w:hAnsi="Consolas"/>
         </w:rPr>
         <w:t>New-Item -ItemType Directory -Path C:\</w:t>
@@ -840,15 +676,101 @@
           <w:rFonts w:ascii="Consolas" w:hAnsi="Consolas"/>
         </w:rPr>
         <w:br/>
-        <w:t>$ShortName = $env:COMPUTERNAME</w:t>
-      </w:r>
+        <w:t>$</w:t>
+      </w:r>
+      <w:proofErr w:type="spellStart"/>
+      <w:r>
+        <w:rPr>
+          <w:rFonts w:ascii="Consolas" w:hAnsi="Consolas"/>
+        </w:rPr>
+        <w:t>ShortName</w:t>
+      </w:r>
+      <w:proofErr w:type="spellEnd"/>
+      <w:r>
+        <w:rPr>
+          <w:rFonts w:ascii="Consolas" w:hAnsi="Consolas"/>
+        </w:rPr>
+        <w:t xml:space="preserve"> = $</w:t>
+      </w:r>
+      <w:proofErr w:type="spellStart"/>
+      <w:r>
+        <w:rPr>
+          <w:rFonts w:ascii="Consolas" w:hAnsi="Consolas"/>
+        </w:rPr>
+        <w:t>env:COMPUTERNAME</w:t>
+      </w:r>
+      <w:proofErr w:type="spellEnd"/>
       <w:r>
         <w:rPr>
           <w:rFonts w:ascii="Consolas" w:hAnsi="Consolas"/>
         </w:rPr>
         <w:br/>
-        <w:t>$Fqdn = [System.Net.Dns]::GetHostEntry($ShortName).HostName</w:t>
-      </w:r>
+        <w:t>$</w:t>
+      </w:r>
+      <w:proofErr w:type="spellStart"/>
+      <w:r>
+        <w:rPr>
+          <w:rFonts w:ascii="Consolas" w:hAnsi="Consolas"/>
+        </w:rPr>
+        <w:t>Fqdn</w:t>
+      </w:r>
+      <w:proofErr w:type="spellEnd"/>
+      <w:r>
+        <w:rPr>
+          <w:rFonts w:ascii="Consolas" w:hAnsi="Consolas"/>
+        </w:rPr>
+        <w:t xml:space="preserve"> = [</w:t>
+      </w:r>
+      <w:proofErr w:type="spellStart"/>
+      <w:r>
+        <w:rPr>
+          <w:rFonts w:ascii="Consolas" w:hAnsi="Consolas"/>
+        </w:rPr>
+        <w:t>System.Net.Dns</w:t>
+      </w:r>
+      <w:proofErr w:type="spellEnd"/>
+      <w:r>
+        <w:rPr>
+          <w:rFonts w:ascii="Consolas" w:hAnsi="Consolas"/>
+        </w:rPr>
+        <w:t>]::</w:t>
+      </w:r>
+      <w:proofErr w:type="spellStart"/>
+      <w:r>
+        <w:rPr>
+          <w:rFonts w:ascii="Consolas" w:hAnsi="Consolas"/>
+        </w:rPr>
+        <w:t>GetHostEntry</w:t>
+      </w:r>
+      <w:proofErr w:type="spellEnd"/>
+      <w:r>
+        <w:rPr>
+          <w:rFonts w:ascii="Consolas" w:hAnsi="Consolas"/>
+        </w:rPr>
+        <w:t>($</w:t>
+      </w:r>
+      <w:proofErr w:type="spellStart"/>
+      <w:r>
+        <w:rPr>
+          <w:rFonts w:ascii="Consolas" w:hAnsi="Consolas"/>
+        </w:rPr>
+        <w:t>ShortName</w:t>
+      </w:r>
+      <w:proofErr w:type="spellEnd"/>
+      <w:r>
+        <w:rPr>
+          <w:rFonts w:ascii="Consolas" w:hAnsi="Consolas"/>
+        </w:rPr>
+        <w:t>).</w:t>
+      </w:r>
+      <w:proofErr w:type="spellStart"/>
+      <w:r>
+        <w:rPr>
+          <w:rFonts w:ascii="Consolas" w:hAnsi="Consolas"/>
+        </w:rPr>
+        <w:t>HostName</w:t>
+      </w:r>
+      <w:proofErr w:type="spellEnd"/>
       <w:r>
         <w:rPr>
           <w:rFonts w:ascii="Consolas" w:hAnsi="Consolas"/>
@@ -887,48 +809,134 @@
           <w:rFonts w:ascii="Consolas" w:hAnsi="Consolas"/>
         </w:rPr>
         <w:br/>
-        <w:t>[NewRequest]</w:t>
+        <w:t>[</w:t>
+      </w:r>
+      <w:proofErr w:type="spellStart"/>
+      <w:r>
+        <w:rPr>
+          <w:rFonts w:ascii="Consolas" w:hAnsi="Consolas"/>
+        </w:rPr>
+        <w:t>NewRequest</w:t>
+      </w:r>
+      <w:proofErr w:type="spellEnd"/>
+      <w:r>
+        <w:rPr>
+          <w:rFonts w:ascii="Consolas" w:hAnsi="Consolas"/>
+        </w:rPr>
+        <w:t>]</w:t>
       </w:r>
       <w:r>
         <w:rPr>
           <w:rFonts w:ascii="Consolas" w:hAnsi="Consolas"/>
         </w:rPr>
         <w:br/>
-        <w:t>Subject = "CN=$Fqdn"</w:t>
+        <w:t>Subject = "CN=$</w:t>
+      </w:r>
+      <w:proofErr w:type="spellStart"/>
+      <w:r>
+        <w:rPr>
+          <w:rFonts w:ascii="Consolas" w:hAnsi="Consolas"/>
+        </w:rPr>
+        <w:t>Fqdn</w:t>
+      </w:r>
+      <w:proofErr w:type="spellEnd"/>
+      <w:r>
+        <w:rPr>
+          <w:rFonts w:ascii="Consolas" w:hAnsi="Consolas"/>
+        </w:rPr>
+        <w:t>"</w:t>
       </w:r>
       <w:r>
         <w:rPr>
           <w:rFonts w:ascii="Consolas" w:hAnsi="Consolas"/>
         </w:rPr>
         <w:br/>
-        <w:t>KeyLength = 2048</w:t>
+      </w:r>
+      <w:proofErr w:type="spellStart"/>
+      <w:r>
+        <w:rPr>
+          <w:rFonts w:ascii="Consolas" w:hAnsi="Consolas"/>
+        </w:rPr>
+        <w:t>KeyLength</w:t>
+      </w:r>
+      <w:proofErr w:type="spellEnd"/>
+      <w:r>
+        <w:rPr>
+          <w:rFonts w:ascii="Consolas" w:hAnsi="Consolas"/>
+        </w:rPr>
+        <w:t xml:space="preserve"> = 2048</w:t>
       </w:r>
       <w:r>
         <w:rPr>
           <w:rFonts w:ascii="Consolas" w:hAnsi="Consolas"/>
         </w:rPr>
         <w:br/>
-        <w:t>KeySpec = 1</w:t>
+      </w:r>
+      <w:proofErr w:type="spellStart"/>
+      <w:r>
+        <w:rPr>
+          <w:rFonts w:ascii="Consolas" w:hAnsi="Consolas"/>
+        </w:rPr>
+        <w:t>KeySpec</w:t>
+      </w:r>
+      <w:proofErr w:type="spellEnd"/>
+      <w:r>
+        <w:rPr>
+          <w:rFonts w:ascii="Consolas" w:hAnsi="Consolas"/>
+        </w:rPr>
+        <w:t xml:space="preserve"> = 1</w:t>
       </w:r>
       <w:r>
         <w:rPr>
           <w:rFonts w:ascii="Consolas" w:hAnsi="Consolas"/>
         </w:rPr>
         <w:br/>
-        <w:t>KeyUsage = 0xA0</w:t>
+      </w:r>
+      <w:proofErr w:type="spellStart"/>
+      <w:r>
+        <w:rPr>
+          <w:rFonts w:ascii="Consolas" w:hAnsi="Consolas"/>
+        </w:rPr>
+        <w:t>KeyUsage</w:t>
+      </w:r>
+      <w:proofErr w:type="spellEnd"/>
+      <w:r>
+        <w:rPr>
+          <w:rFonts w:ascii="Consolas" w:hAnsi="Consolas"/>
+        </w:rPr>
+        <w:t xml:space="preserve"> = 0xA0</w:t>
       </w:r>
       <w:r>
         <w:rPr>
           <w:rFonts w:ascii="Consolas" w:hAnsi="Consolas"/>
         </w:rPr>
         <w:br/>
-        <w:t>MachineKeySet = TRUE</w:t>
+      </w:r>
+      <w:proofErr w:type="spellStart"/>
+      <w:r>
+        <w:rPr>
+          <w:rFonts w:ascii="Consolas" w:hAnsi="Consolas"/>
+        </w:rPr>
+        <w:t>MachineKeySet</w:t>
+      </w:r>
+      <w:proofErr w:type="spellEnd"/>
+      <w:r>
+        <w:rPr>
+          <w:rFonts w:ascii="Consolas" w:hAnsi="Consolas"/>
+        </w:rPr>
+        <w:t xml:space="preserve"> = TRUE</w:t>
       </w:r>
       <w:r>
         <w:rPr>
           <w:rFonts w:ascii="Consolas" w:hAnsi="Consolas"/>
         </w:rPr>
         <w:br/>
+      </w:r>
+      <w:r>
+        <w:rPr>
+          <w:rFonts w:ascii="Consolas" w:hAnsi="Consolas"/>
+        </w:rPr>
+        <w:lastRenderedPageBreak/>
         <w:t>Exportable = TRUE</w:t>
       </w:r>
       <w:r>
@@ -936,7 +944,20 @@
           <w:rFonts w:ascii="Consolas" w:hAnsi="Consolas"/>
         </w:rPr>
         <w:br/>
-        <w:t>RequestType = PKCS10</w:t>
+      </w:r>
+      <w:proofErr w:type="spellStart"/>
+      <w:r>
+        <w:rPr>
+          <w:rFonts w:ascii="Consolas" w:hAnsi="Consolas"/>
+        </w:rPr>
+        <w:t>RequestType</w:t>
+      </w:r>
+      <w:proofErr w:type="spellEnd"/>
+      <w:r>
+        <w:rPr>
+          <w:rFonts w:ascii="Consolas" w:hAnsi="Consolas"/>
+        </w:rPr>
+        <w:t xml:space="preserve"> = PKCS10</w:t>
       </w:r>
       <w:r>
         <w:rPr>
@@ -944,19 +965,39 @@
         </w:rPr>
         <w:br/>
       </w:r>
-      <w:r>
-        <w:rPr>
-          <w:rFonts w:ascii="Consolas" w:hAnsi="Consolas"/>
-        </w:rPr>
-        <w:lastRenderedPageBreak/>
-        <w:t>ProviderName = "Microsoft RSA SChannel Cryptographic Provider"</w:t>
+      <w:proofErr w:type="spellStart"/>
+      <w:r>
+        <w:rPr>
+          <w:rFonts w:ascii="Consolas" w:hAnsi="Consolas"/>
+        </w:rPr>
+        <w:t>ProviderName</w:t>
+      </w:r>
+      <w:proofErr w:type="spellEnd"/>
+      <w:r>
+        <w:rPr>
+          <w:rFonts w:ascii="Consolas" w:hAnsi="Consolas"/>
+        </w:rPr>
+        <w:t xml:space="preserve"> = "Microsoft RSA SChannel Cryptographic Provider"</w:t>
       </w:r>
       <w:r>
         <w:rPr>
           <w:rFonts w:ascii="Consolas" w:hAnsi="Consolas"/>
         </w:rPr>
         <w:br/>
-        <w:t>HashAlgorithm = SHA256</w:t>
+      </w:r>
+      <w:proofErr w:type="spellStart"/>
+      <w:r>
+        <w:rPr>
+          <w:rFonts w:ascii="Consolas" w:hAnsi="Consolas"/>
+        </w:rPr>
+        <w:t>HashAlgorithm</w:t>
+      </w:r>
+      <w:proofErr w:type="spellEnd"/>
+      <w:r>
+        <w:rPr>
+          <w:rFonts w:ascii="Consolas" w:hAnsi="Consolas"/>
+        </w:rPr>
+        <w:t xml:space="preserve"> = SHA256</w:t>
       </w:r>
       <w:r>
         <w:rPr>
@@ -983,14 +1024,70 @@
           <w:rFonts w:ascii="Consolas" w:hAnsi="Consolas"/>
         </w:rPr>
         <w:br/>
-        <w:t>_continue_ = "dns=$ShortName&amp;"</w:t>
+        <w:t>_continue_ = "</w:t>
+      </w:r>
+      <w:proofErr w:type="spellStart"/>
+      <w:r>
+        <w:rPr>
+          <w:rFonts w:ascii="Consolas" w:hAnsi="Consolas"/>
+        </w:rPr>
+        <w:t>dns</w:t>
+      </w:r>
+      <w:proofErr w:type="spellEnd"/>
+      <w:r>
+        <w:rPr>
+          <w:rFonts w:ascii="Consolas" w:hAnsi="Consolas"/>
+        </w:rPr>
+        <w:t>=$</w:t>
+      </w:r>
+      <w:proofErr w:type="spellStart"/>
+      <w:r>
+        <w:rPr>
+          <w:rFonts w:ascii="Consolas" w:hAnsi="Consolas"/>
+        </w:rPr>
+        <w:t>ShortName</w:t>
+      </w:r>
+      <w:proofErr w:type="spellEnd"/>
+      <w:r>
+        <w:rPr>
+          <w:rFonts w:ascii="Consolas" w:hAnsi="Consolas"/>
+        </w:rPr>
+        <w:t>&amp;"</w:t>
       </w:r>
       <w:r>
         <w:rPr>
           <w:rFonts w:ascii="Consolas" w:hAnsi="Consolas"/>
         </w:rPr>
         <w:br/>
-        <w:t>_continue_ = "dns=$Fqdn"</w:t>
+        <w:t>_continue_ = "</w:t>
+      </w:r>
+      <w:proofErr w:type="spellStart"/>
+      <w:r>
+        <w:rPr>
+          <w:rFonts w:ascii="Consolas" w:hAnsi="Consolas"/>
+        </w:rPr>
+        <w:t>dns</w:t>
+      </w:r>
+      <w:proofErr w:type="spellEnd"/>
+      <w:r>
+        <w:rPr>
+          <w:rFonts w:ascii="Consolas" w:hAnsi="Consolas"/>
+        </w:rPr>
+        <w:t>=$</w:t>
+      </w:r>
+      <w:proofErr w:type="spellStart"/>
+      <w:r>
+        <w:rPr>
+          <w:rFonts w:ascii="Consolas" w:hAnsi="Consolas"/>
+        </w:rPr>
+        <w:t>Fqdn</w:t>
+      </w:r>
+      <w:proofErr w:type="spellEnd"/>
+      <w:r>
+        <w:rPr>
+          <w:rFonts w:ascii="Consolas" w:hAnsi="Consolas"/>
+        </w:rPr>
+        <w:t>"</w:t>
       </w:r>
       <w:r>
         <w:rPr>
@@ -1003,7 +1100,21 @@
           <w:rFonts w:ascii="Consolas" w:hAnsi="Consolas"/>
         </w:rPr>
         <w:br/>
-        <w:t>[EnhancedKeyUsageExtension]</w:t>
+        <w:t>[</w:t>
+      </w:r>
+      <w:proofErr w:type="spellStart"/>
+      <w:r>
+        <w:rPr>
+          <w:rFonts w:ascii="Consolas" w:hAnsi="Consolas"/>
+        </w:rPr>
+        <w:t>EnhancedKeyUsageExtension</w:t>
+      </w:r>
+      <w:proofErr w:type="spellEnd"/>
+      <w:r>
+        <w:rPr>
+          <w:rFonts w:ascii="Consolas" w:hAnsi="Consolas"/>
+        </w:rPr>
+        <w:t>]</w:t>
       </w:r>
       <w:r>
         <w:rPr>
@@ -1101,11 +1212,6 @@
       </w:r>
     </w:p>
     <w:p>
-      <w:pPr>
-        <w:rPr>
-          <w:rFonts w:hint="eastAsia"/>
-        </w:rPr>
-      </w:pPr>
       <w:proofErr w:type="spellStart"/>
       <w:r>
         <w:rPr>
@@ -1396,11 +1502,6 @@
       </w:r>
     </w:p>
     <w:p>
-      <w:pPr>
-        <w:rPr>
-          <w:rFonts w:hint="eastAsia"/>
-        </w:rPr>
-      </w:pPr>
       <w:r>
         <w:rPr>
           <w:rFonts w:ascii="Consolas" w:hAnsi="Consolas"/>
@@ -1435,16 +1536,10 @@
           <w:b/>
           <w:bCs/>
         </w:rPr>
-        <w:lastRenderedPageBreak/>
         <w:t>9. Accept the issued certificate and verify the private key</w:t>
       </w:r>
     </w:p>
     <w:p>
-      <w:pPr>
-        <w:rPr>
-          <w:rFonts w:hint="eastAsia"/>
-        </w:rPr>
-      </w:pPr>
       <w:proofErr w:type="spellStart"/>
       <w:r>
         <w:rPr>
@@ -1478,11 +1573,6 @@
       </w:r>
     </w:p>
     <w:p>
-      <w:pPr>
-        <w:rPr>
-          <w:rFonts w:hint="eastAsia"/>
-        </w:rPr>
-      </w:pPr>
       <w:r>
         <w:rPr>
           <w:rFonts w:ascii="Consolas" w:hAnsi="Consolas"/>
@@ -1492,10 +1582,7 @@
     </w:p>
     <w:p>
       <w:r>
-        <w:t xml:space="preserve">Go to Local Computer &gt; Personal &gt; Certificates and open the newly issued certificate. Verify </w:t>
-      </w:r>
-      <w:r>
-        <w:t>the following:</w:t>
+        <w:t>Go to Local Computer &gt; Personal &gt; Certificates and open the newly issued certificate. Verify the following:</w:t>
       </w:r>
     </w:p>
     <w:p>
@@ -1575,18 +1662,10 @@
     </w:p>
     <w:p>
       <w:r>
-        <w:t xml:space="preserve">Save it temporarily, then move it to a </w:t>
-      </w:r>
-      <w:r>
-        <w:t>Tomcat SSL folder:</w:t>
+        <w:t>Save it temporarily, then move it to a Tomcat SSL folder:</w:t>
       </w:r>
     </w:p>
     <w:p>
-      <w:pPr>
-        <w:rPr>
-          <w:rFonts w:hint="eastAsia"/>
-        </w:rPr>
-      </w:pPr>
       <w:r>
         <w:rPr>
           <w:rFonts w:ascii="Consolas" w:hAnsi="Consolas"/>
@@ -1604,11 +1683,6 @@
           <w:rFonts w:ascii="Consolas" w:hAnsi="Consolas"/>
         </w:rPr>
         <w:br/>
-      </w:r>
-      <w:r>
-        <w:rPr>
-          <w:rFonts w:ascii="Consolas" w:hAnsi="Consolas"/>
-        </w:rPr>
         <w:t>Move-Item "C:\Temp\webfocus.pfx" `</w:t>
       </w:r>
       <w:r>
@@ -1675,11 +1749,6 @@
       </w:r>
     </w:p>
     <w:p>
-      <w:pPr>
-        <w:rPr>
-          <w:rFonts w:hint="eastAsia"/>
-        </w:rPr>
-      </w:pPr>
       <w:r>
         <w:rPr>
           <w:rFonts w:ascii="Consolas" w:hAnsi="Consolas"/>
@@ -1704,47 +1773,42 @@
     <w:p>
       <w:r>
         <w:t>Enter the PFX password when prompted. Confirm the entry type is:</w:t>
+      </w:r>
+    </w:p>
+    <w:p>
+      <w:r>
+        <w:rPr>
+          <w:rFonts w:ascii="Consolas" w:hAnsi="Consolas"/>
+        </w:rPr>
+        <w:t>PrivateKeyEntry</w:t>
+      </w:r>
+    </w:p>
+    <w:p>
+      <w:r>
+        <w:t>If it is only trustedCertEntry, stop; the PFX does not contain the private key.</w:t>
       </w:r>
     </w:p>
     <w:p>
       <w:pPr>
         <w:rPr>
-          <w:rFonts w:hint="eastAsia"/>
+          <w:b/>
+          <w:bCs/>
         </w:rPr>
       </w:pPr>
       <w:r>
         <w:rPr>
-          <w:rFonts w:ascii="Consolas" w:hAnsi="Consolas"/>
-        </w:rPr>
-        <w:t>PrivateKeyEntry</w:t>
+          <w:b/>
+          <w:bCs/>
+        </w:rPr>
+        <w:t>12. Add HTTPS to Tomcat without removing HTTP</w:t>
       </w:r>
     </w:p>
     <w:p>
       <w:r>
-        <w:t>If it is only trustedCertEntry, stop; the PFX does not contain the private key.</w:t>
+        <w:t>Leave the current HTTP Connector exactly as it is. Add a second HTTPS Connector inside the same &lt;Service name="Catalina"&gt; section.</w:t>
       </w:r>
     </w:p>
     <w:p>
-      <w:pPr>
-        <w:rPr>
-          <w:b/>
-          <w:bCs/>
-        </w:rPr>
-      </w:pPr>
-      <w:r>
-        <w:rPr>
-          <w:b/>
-          <w:bCs/>
-        </w:rPr>
-        <w:t>12. Add HTTPS to Tomcat without removing HTTP</w:t>
-      </w:r>
-    </w:p>
-    <w:p>
-      <w:r>
-        <w:t>Leave the current HTTP Connector exactly as it is. Add a second HTTPS Connector inside the same &lt;Service name="Catalina"&gt; section.</w:t>
-      </w:r>
-    </w:p>
-    <w:p>
       <w:r>
         <w:rPr>
           <w:rFonts w:ascii="Consolas" w:hAnsi="Consolas"/>
@@ -1777,6 +1841,12 @@
           <w:rFonts w:ascii="Consolas" w:hAnsi="Consolas"/>
         </w:rPr>
         <w:br/>
+      </w:r>
+      <w:r>
+        <w:rPr>
+          <w:rFonts w:ascii="Consolas" w:hAnsi="Consolas"/>
+        </w:rPr>
+        <w:lastRenderedPageBreak/>
         <w:t xml:space="preserve">           redirectPort="8443" /&gt;</w:t>
       </w:r>
       <w:r>
@@ -1790,12 +1860,6 @@
           <w:rFonts w:ascii="Consolas" w:hAnsi="Consolas"/>
         </w:rPr>
         <w:br/>
-      </w:r>
-      <w:r>
-        <w:rPr>
-          <w:rFonts w:ascii="Consolas" w:hAnsi="Consolas"/>
-        </w:rPr>
-        <w:lastRenderedPageBreak/>
         <w:t>&lt;!-- NEW HTTPS CONNECTOR --&gt;</w:t>
       </w:r>
       <w:r>
@@ -1845,11 +1909,6 @@
           <w:rFonts w:ascii="Consolas" w:hAnsi="Consolas"/>
         </w:rPr>
         <w:br/>
-      </w:r>
-      <w:r>
-        <w:rPr>
-          <w:rFonts w:ascii="Consolas" w:hAnsi="Consolas"/>
-        </w:rPr>
         <w:t xml:space="preserve">    </w:t>
       </w:r>
       <w:proofErr w:type="spellStart"/>
@@ -2060,35 +2119,7 @@
           <w:rFonts w:ascii="Consolas" w:hAnsi="Consolas"/>
         </w:rPr>
         <w:br/>
-        <w:t xml:space="preserve"> </w:t>
-      </w:r>
-      <w:proofErr w:type="gramStart"/>
-      <w:r>
-        <w:rPr>
-          <w:rFonts w:ascii="Consolas" w:hAnsi="Consolas"/>
-        </w:rPr>
-        <w:t xml:space="preserve">   [</w:t>
-      </w:r>
-      <w:proofErr w:type="gramEnd"/>
-      <w:r>
-        <w:rPr>
-          <w:rFonts w:ascii="Consolas" w:hAnsi="Consolas"/>
-        </w:rPr>
-        <w:t>xml</w:t>
-      </w:r>
-      <w:proofErr w:type="gramStart"/>
-      <w:r>
-        <w:rPr>
-          <w:rFonts w:ascii="Consolas" w:hAnsi="Consolas"/>
-        </w:rPr>
-        <w:t>](</w:t>
-      </w:r>
-      <w:proofErr w:type="gramEnd"/>
-      <w:r>
-        <w:rPr>
-          <w:rFonts w:ascii="Consolas" w:hAnsi="Consolas"/>
-        </w:rPr>
-        <w:t>Get-Content "C:\ibi\tomcat\conf\server.xml") | Out-Null</w:t>
+        <w:t xml:space="preserve">    [xml](Get-Content "C:\ibi\tomcat\conf\server.xml") | Out-Null</w:t>
       </w:r>
       <w:r>
         <w:rPr>
@@ -2123,307 +2154,167 @@
           <w:rFonts w:ascii="Consolas" w:hAnsi="Consolas"/>
         </w:rPr>
         <w:br/>
-        <w:t xml:space="preserve">    Write-Host $</w:t>
-      </w:r>
-      <w:proofErr w:type="gramStart"/>
-      <w:r>
-        <w:rPr>
-          <w:rFonts w:ascii="Consolas" w:hAnsi="Consolas"/>
-        </w:rPr>
-        <w:t>_.Exception.Message</w:t>
-      </w:r>
-      <w:proofErr w:type="gramEnd"/>
+        <w:t xml:space="preserve">    Write-Host $_.Exception.Message</w:t>
+      </w:r>
       <w:r>
         <w:rPr>
           <w:rFonts w:ascii="Consolas" w:hAnsi="Consolas"/>
         </w:rPr>
         <w:br/>
         <w:t>}</w:t>
+      </w:r>
+    </w:p>
+    <w:p/>
+    <w:p>
+      <w:pPr>
+        <w:rPr>
+          <w:b/>
+          <w:bCs/>
+        </w:rPr>
+      </w:pPr>
+      <w:r>
+        <w:rPr>
+          <w:b/>
+          <w:bCs/>
+        </w:rPr>
+        <w:t>14. Permit TCP 443 and restart Tomcat</w:t>
+      </w:r>
+    </w:p>
+    <w:p>
+      <w:r>
+        <w:t>If Windows Firewall is locally managed and there is no existing rule, create an internal-only HTTPS rule appropriate to your network policy. Then restart the Tomcat service.</w:t>
+      </w:r>
+    </w:p>
+    <w:p>
+      <w:r>
+        <w:rPr>
+          <w:rFonts w:ascii="Consolas" w:hAnsi="Consolas"/>
+        </w:rPr>
+        <w:t>Get-Service | Where-Object {$_.Name -match "Tomcat" -or $_.DisplayName -match "Tomcat"}</w:t>
+      </w:r>
+      <w:r>
+        <w:rPr>
+          <w:rFonts w:ascii="Consolas" w:hAnsi="Consolas"/>
+        </w:rPr>
+        <w:br/>
+      </w:r>
+      <w:r>
+        <w:rPr>
+          <w:rFonts w:ascii="Consolas" w:hAnsi="Consolas"/>
+        </w:rPr>
+        <w:br/>
+        <w:t>Restart-Service &lt;TomcatServiceName&gt;</w:t>
+      </w:r>
+    </w:p>
+    <w:p>
+      <w:r>
+        <w:t>Confirm both the new HTTPS port and the existing HTTP port are listening:</w:t>
       </w:r>
     </w:p>
     <w:p>
       <w:pPr>
         <w:rPr>
-          <w:rFonts w:hint="eastAsia"/>
+          <w:rFonts w:ascii="Consolas" w:hAnsi="Consolas"/>
         </w:rPr>
       </w:pPr>
+      <w:r>
+        <w:rPr>
+          <w:rFonts w:ascii="Consolas" w:hAnsi="Consolas"/>
+        </w:rPr>
+        <w:t>Get-NetTCPConnection -State Listen |</w:t>
+      </w:r>
+      <w:r>
+        <w:rPr>
+          <w:rFonts w:ascii="Consolas" w:hAnsi="Consolas"/>
+        </w:rPr>
+        <w:br/>
+        <w:t>Where-Object { $_.LocalPort -in 443,&lt;HTTP_PORT&gt; } |</w:t>
+      </w:r>
+      <w:r>
+        <w:rPr>
+          <w:rFonts w:ascii="Consolas" w:hAnsi="Consolas"/>
+        </w:rPr>
+        <w:br/>
+        <w:t>Sort-Object LocalPort |</w:t>
+      </w:r>
+      <w:r>
+        <w:rPr>
+          <w:rFonts w:ascii="Consolas" w:hAnsi="Consolas"/>
+        </w:rPr>
+        <w:br/>
+        <w:t xml:space="preserve">Format-Table </w:t>
+      </w:r>
+      <w:proofErr w:type="spellStart"/>
+      <w:r>
+        <w:rPr>
+          <w:rFonts w:ascii="Consolas" w:hAnsi="Consolas"/>
+        </w:rPr>
+        <w:t>LocalAddress,LocalPort,OwningProcess</w:t>
+      </w:r>
+      <w:proofErr w:type="spellEnd"/>
+    </w:p>
+    <w:p/>
+    <w:p>
+      <w:pPr>
+        <w:rPr>
+          <w:b/>
+          <w:bCs/>
+        </w:rPr>
+      </w:pPr>
+      <w:r>
+        <w:rPr>
+          <w:b/>
+          <w:bCs/>
+        </w:rPr>
+        <w:t>15. Validate HTTP first, then HTTPS</w:t>
+      </w:r>
     </w:p>
     <w:p>
-      <w:pPr>
-        <w:rPr>
-          <w:b/>
-          <w:bCs/>
-        </w:rPr>
-      </w:pPr>
-      <w:r>
-        <w:rPr>
-          <w:b/>
-          <w:bCs/>
-        </w:rPr>
-        <w:t>14. Permit TCP 443 and restart Tomcat</w:t>
+      <w:r>
+        <w:t>First confirm the original HTTP URL still works:</w:t>
       </w:r>
     </w:p>
     <w:p>
       <w:r>
-        <w:t>If Windows Firewall is locally managed and there is no existing rule, create an internal-only HTTPS rule appropriate to your network policy. Then restart the Tomcat service.</w:t>
+        <w:rPr>
+          <w:rFonts w:ascii="Consolas" w:hAnsi="Consolas"/>
+        </w:rPr>
+        <w:t>http://SERVERNAME:&lt;HTTP_PORT&gt;/ibi_apps</w:t>
       </w:r>
     </w:p>
     <w:p>
-      <w:pPr>
-        <w:rPr>
-          <w:rFonts w:hint="eastAsia"/>
-        </w:rPr>
-      </w:pPr>
-      <w:r>
-        <w:rPr>
-          <w:rFonts w:ascii="Consolas" w:hAnsi="Consolas"/>
-        </w:rPr>
-        <w:t>Get-Service | Where-Object {</w:t>
-      </w:r>
-      <w:r>
-        <w:rPr>
-          <w:rFonts w:ascii="Consolas" w:hAnsi="Consolas"/>
-        </w:rPr>
-        <w:t>$</w:t>
-      </w:r>
-      <w:proofErr w:type="gramStart"/>
-      <w:r>
-        <w:rPr>
-          <w:rFonts w:ascii="Consolas" w:hAnsi="Consolas"/>
-        </w:rPr>
-        <w:t>_.Name</w:t>
-      </w:r>
-      <w:proofErr w:type="gramEnd"/>
-      <w:r>
-        <w:rPr>
-          <w:rFonts w:ascii="Consolas" w:hAnsi="Consolas"/>
-        </w:rPr>
-        <w:t xml:space="preserve"> -match "Tomcat" -or $</w:t>
-      </w:r>
-      <w:proofErr w:type="gramStart"/>
-      <w:r>
-        <w:rPr>
-          <w:rFonts w:ascii="Consolas" w:hAnsi="Consolas"/>
-        </w:rPr>
-        <w:t>_.DisplayName</w:t>
-      </w:r>
-      <w:proofErr w:type="gramEnd"/>
-      <w:r>
-        <w:rPr>
-          <w:rFonts w:ascii="Consolas" w:hAnsi="Consolas"/>
-        </w:rPr>
-        <w:t xml:space="preserve"> -match "Tomcat"</w:t>
-      </w:r>
-      <w:r>
-        <w:rPr>
-          <w:rFonts w:ascii="Consolas" w:hAnsi="Consolas"/>
-        </w:rPr>
-        <w:t>}</w:t>
-      </w:r>
-      <w:r>
-        <w:rPr>
-          <w:rFonts w:ascii="Consolas" w:hAnsi="Consolas"/>
-        </w:rPr>
-        <w:br/>
-      </w:r>
-      <w:r>
-        <w:rPr>
-          <w:rFonts w:ascii="Consolas" w:hAnsi="Consolas"/>
-        </w:rPr>
-        <w:br/>
-        <w:t>Restart-Service &lt;TomcatServiceName&gt;</w:t>
+      <w:r>
+        <w:lastRenderedPageBreak/>
+        <w:t>Then test the new HTTPS URL:</w:t>
       </w:r>
     </w:p>
     <w:p>
       <w:r>
-        <w:t>Confirm both the new HTTPS port and the existing HTTP port are listening:</w:t>
+        <w:rPr>
+          <w:rFonts w:ascii="Consolas" w:hAnsi="Consolas"/>
+        </w:rPr>
+        <w:t>https://SERVERNAME/ibi_apps</w:t>
       </w:r>
     </w:p>
     <w:p>
-      <w:pPr>
-        <w:rPr>
-          <w:rFonts w:ascii="Consolas" w:hAnsi="Consolas"/>
-        </w:rPr>
-      </w:pPr>
-      <w:r>
-        <w:rPr>
-          <w:rFonts w:ascii="Consolas" w:hAnsi="Consolas"/>
-        </w:rPr>
-        <w:t>Get-NetTCPConnection -State Listen |</w:t>
-      </w:r>
-      <w:r>
-        <w:rPr>
-          <w:rFonts w:ascii="Consolas" w:hAnsi="Consolas"/>
-        </w:rPr>
-        <w:br/>
-        <w:t xml:space="preserve">Where-Object </w:t>
-      </w:r>
-      <w:proofErr w:type="gramStart"/>
-      <w:r>
-        <w:rPr>
-          <w:rFonts w:ascii="Consolas" w:hAnsi="Consolas"/>
-        </w:rPr>
-        <w:t>{ $_.LocalPort</w:t>
-      </w:r>
-      <w:proofErr w:type="gramEnd"/>
-      <w:r>
-        <w:rPr>
-          <w:rFonts w:ascii="Consolas" w:hAnsi="Consolas"/>
-        </w:rPr>
-        <w:t xml:space="preserve"> -in </w:t>
-      </w:r>
-      <w:proofErr w:type="gramStart"/>
-      <w:r>
-        <w:rPr>
-          <w:rFonts w:ascii="Consolas" w:hAnsi="Consolas"/>
-        </w:rPr>
-        <w:t>443,&lt;</w:t>
-      </w:r>
-      <w:proofErr w:type="gramEnd"/>
-      <w:r>
-        <w:rPr>
-          <w:rFonts w:ascii="Consolas" w:hAnsi="Consolas"/>
-        </w:rPr>
-        <w:t>HTTP_PORT</w:t>
-      </w:r>
-      <w:proofErr w:type="gramStart"/>
-      <w:r>
-        <w:rPr>
-          <w:rFonts w:ascii="Consolas" w:hAnsi="Consolas"/>
-        </w:rPr>
-        <w:t>&gt; }</w:t>
-      </w:r>
-      <w:proofErr w:type="gramEnd"/>
-      <w:r>
-        <w:rPr>
-          <w:rFonts w:ascii="Consolas" w:hAnsi="Consolas"/>
-        </w:rPr>
-        <w:t xml:space="preserve"> |</w:t>
-      </w:r>
-      <w:r>
-        <w:rPr>
-          <w:rFonts w:ascii="Consolas" w:hAnsi="Consolas"/>
-        </w:rPr>
-        <w:br/>
-        <w:t>Sort-Object LocalPort |</w:t>
-      </w:r>
-      <w:r>
-        <w:rPr>
-          <w:rFonts w:ascii="Consolas" w:hAnsi="Consolas"/>
-        </w:rPr>
-        <w:br/>
-      </w:r>
-      <w:r>
-        <w:rPr>
-          <w:rFonts w:ascii="Consolas" w:hAnsi="Consolas"/>
-        </w:rPr>
-        <w:t xml:space="preserve">Format-Table </w:t>
-      </w:r>
-      <w:proofErr w:type="spellStart"/>
-      <w:proofErr w:type="gramStart"/>
-      <w:r>
-        <w:rPr>
-          <w:rFonts w:ascii="Consolas" w:hAnsi="Consolas"/>
-        </w:rPr>
-        <w:t>LocalAddress,LocalPort</w:t>
-      </w:r>
-      <w:proofErr w:type="gramEnd"/>
-      <w:r>
-        <w:rPr>
-          <w:rFonts w:ascii="Consolas" w:hAnsi="Consolas"/>
-        </w:rPr>
-        <w:t>,OwningProcess</w:t>
-      </w:r>
-      <w:proofErr w:type="spellEnd"/>
+      <w:r>
+        <w:t>Also test the FQDN form because it is included in the certificate:</w:t>
+      </w:r>
     </w:p>
     <w:p>
-      <w:pPr>
-        <w:rPr>
-          <w:rFonts w:hint="eastAsia"/>
-        </w:rPr>
-      </w:pPr>
+      <w:r>
+        <w:rPr>
+          <w:rFonts w:ascii="Consolas" w:hAnsi="Consolas"/>
+        </w:rPr>
+        <w:t>https://SERVERNAME.domain.example/ibi_apps</w:t>
+      </w:r>
     </w:p>
     <w:p>
-      <w:pPr>
-        <w:rPr>
-          <w:b/>
-          <w:bCs/>
-        </w:rPr>
-      </w:pPr>
-      <w:r>
-        <w:rPr>
-          <w:b/>
-          <w:bCs/>
-        </w:rPr>
-        <w:t>15. Validate HTTP first, then HTTPS</w:t>
+      <w:r>
+        <w:t>Basic connectivity tests:</w:t>
       </w:r>
     </w:p>
     <w:p>
-      <w:r>
-        <w:t>First confirm the original HTTP URL still works:</w:t>
-      </w:r>
-    </w:p>
-    <w:p>
-      <w:pPr>
-        <w:rPr>
-          <w:rFonts w:hint="eastAsia"/>
-        </w:rPr>
-      </w:pPr>
-      <w:r>
-        <w:rPr>
-          <w:rFonts w:ascii="Consolas" w:hAnsi="Consolas"/>
-        </w:rPr>
-        <w:t>http://SERVERNAME:&lt;HTTP_PORT&gt;/ibi_apps</w:t>
-      </w:r>
-    </w:p>
-    <w:p>
-      <w:r>
-        <w:t>Then test the new HTTPS URL:</w:t>
-      </w:r>
-    </w:p>
-    <w:p>
-      <w:pPr>
-        <w:rPr>
-          <w:rFonts w:hint="eastAsia"/>
-        </w:rPr>
-      </w:pPr>
-      <w:r>
-        <w:rPr>
-          <w:rFonts w:ascii="Consolas" w:hAnsi="Consolas"/>
-        </w:rPr>
-        <w:t>https://SERVERNAME/ibi_apps</w:t>
-      </w:r>
-    </w:p>
-    <w:p>
-      <w:r>
-        <w:lastRenderedPageBreak/>
-        <w:t>Also test the FQDN form because it is included in the certificate:</w:t>
-      </w:r>
-    </w:p>
-    <w:p>
-      <w:pPr>
-        <w:rPr>
-          <w:rFonts w:hint="eastAsia"/>
-        </w:rPr>
-      </w:pPr>
-      <w:r>
-        <w:rPr>
-          <w:rFonts w:ascii="Consolas" w:hAnsi="Consolas"/>
-        </w:rPr>
-        <w:t>https://SERVERNAME.domain.example/ibi_apps</w:t>
-      </w:r>
-    </w:p>
-    <w:p>
-      <w:r>
-        <w:t>Basic connectivity tests:</w:t>
-      </w:r>
-    </w:p>
-    <w:p>
-      <w:pPr>
-        <w:rPr>
-          <w:rFonts w:hint="eastAsia"/>
-        </w:rPr>
-      </w:pPr>
       <w:r>
         <w:rPr>
           <w:rFonts w:ascii="Consolas" w:hAnsi="Consolas"/>
@@ -3425,6 +3316,7 @@
   <w:style w:type="character" w:default="1" w:styleId="DefaultParagraphFont">
     <w:name w:val="Default Paragraph Font"/>
     <w:uiPriority w:val="1"/>
+    <w:semiHidden/>
     <w:unhideWhenUsed/>
   </w:style>
   <w:style w:type="table" w:default="1" w:styleId="TableNormal">

</xml_diff>